<commit_message>
contrato-v4.4-contrapropuesta: conserva la cesión de derechos sobre imágenes y contenidos
Revierte el apartado 18 de la auditoría externa en la Décima Sexta I y
en el Anexo Dos V: la cláusula vuelve a ceder la titularidad de los
contenidos e imágenes producidos para EL CLIENTE sin la redacción sobre
el alcance de la transmisión. Se conserva la remisión de la Décima
Primera a las Cláusulas Novena y Décima Sexta para la entrega al cierre
contra pago.

audit-docs.js y consistencia.js limpios; ambos docx válidos. Limpio 45
págs; marcado 77 págs, 1,059 cambios y 125 comentarios.

Co-Authored-By: Claude Fable 5.1 <noreply@anthropic.com>
Claude-Session: https://claude.ai/code/session_01KMnsT4kVv2YSrarkcjkysZ
</commit_message>
<xml_diff>
--- a/versiones-del-contrato/v4.4-contrapropuesta/contrato-v4.4-limpio.docx
+++ b/versiones-del-contrato/v4.4-contrapropuesta/contrato-v4.4-limpio.docx
@@ -17099,7 +17099,7 @@
           <w:sz w:val="22"/>
           <w:szCs w:val="22"/>
         </w:rPr>
-        <w:t xml:space="preserve"> los Componentes Preexistentes. La titularidad, cesión o licencia que corresponda a cada entregable se sujetará a su naturaleza y a las exclusiones e inventario de esta Cláusula y del Anexo Dos, Sección V. La transmisión comprende los derechos que efectivamente existan y sean transmisibles conforme a la legislación aplicable y a las licencias de los componentes utilizados; no constituye garantía de reconocimiento autoral ni de exclusividad sobre elementos que legalmente carezcan de esa protección. Se mantienen las obligaciones de contar con derechos suficientes y de no infracción establecidas en la Cláusula Décima Segunda, fracción V, y en la fracción IV de esta Cláusula.</w:t>
+        <w:t xml:space="preserve"> los Componentes Preexistentes.</w:t>
       </w:r>
     </w:p>
     <w:p>
@@ -36258,7 +36258,7 @@
                 <w:sz w:val="19"/>
                 <w:szCs w:val="19"/>
               </w:rPr>
-              <w:t xml:space="preserve">Titularidad de los derechos que correspondan conforme a la Cláusula Décima Sexta, fracción I, y archivos finales</w:t>
+              <w:t xml:space="preserve">Titularidad y archivos finales</w:t>
             </w:r>
           </w:p>
         </w:tc>

</xml_diff>